<commit_message>
fix: Add defensive null checks to bindEvents listeners preventing startup crash and enabling persistence
</commit_message>
<xml_diff>
--- a/org_Word_Backup_Full/app.js.docx
+++ b/org_Word_Backup_Full/app.js.docx
@@ -7429,21 +7429,21 @@
         <w:t xml:space="preserve">  };</w:t>
         <w:br/>
         <w:br/>
-        <w:t xml:space="preserve">  $("adminBtn").addEventListener("click", openPinDialog);</w:t>
+        <w:t xml:space="preserve">  $("adminBtn")?.addEventListener("click", openPinDialog);</w:t>
         <w:br/>
         <w:t xml:space="preserve">  $("pinForm")?.addEventListener("submit", handlePinSubmit);</w:t>
         <w:br/>
-        <w:t xml:space="preserve">  $("closePinBtn").addEventListener("click", closePinDialog);</w:t>
-        <w:br/>
-        <w:t xml:space="preserve">  $("pinOverlay").addEventListener("click", (event) =&gt; { if (event.target === $("pinOverlay")) closePinDialog(); });</w:t>
-        <w:br/>
-        <w:t xml:space="preserve">  $("closeAdminBtn").addEventListener("click", closeAdmin);</w:t>
+        <w:t xml:space="preserve">  $("closePinBtn")?.addEventListener("click", closePinDialog);</w:t>
+        <w:br/>
+        <w:t xml:space="preserve">  $("pinOverlay")?.addEventListener("click", (event) =&gt; { if (event.target === $("pinOverlay")) closePinDialog(); });</w:t>
+        <w:br/>
+        <w:t xml:space="preserve">  $("closeAdminBtn")?.addEventListener("click", closeAdmin);</w:t>
         <w:br/>
         <w:t xml:space="preserve">  $("switchRoleBtn")?.addEventListener("click", switchAdminRole);</w:t>
         <w:br/>
         <w:t xml:space="preserve">  $("headerExportDataBtn")?.addEventListener("click", exportRoleBackup);</w:t>
         <w:br/>
-        <w:t xml:space="preserve">  $("adminOverlay").addEventListener("click", (event) =&gt; { if (event.target === $("adminOverlay")) closeAdmin(); });</w:t>
+        <w:t xml:space="preserve">  $("adminOverlay")?.addEventListener("click", (event) =&gt; { if (event.target === $("adminOverlay")) closeAdmin(); });</w:t>
         <w:br/>
         <w:t xml:space="preserve">  $$('[data-admin-tab]').forEach((button) =&gt; button.addEventListener("click", () =&gt; setAdminTab(button.dataset.adminTab)));</w:t>
         <w:br/>
@@ -7457,27 +7457,27 @@
         <w:br/>
         <w:t xml:space="preserve">  $$('[data-rich-command]').forEach((button) =&gt; button.addEventListener("click", () =&gt; {</w:t>
         <w:br/>
-        <w:t xml:space="preserve">    $("editDefinition").focus();</w:t>
+        <w:t xml:space="preserve">    $("editDefinition")?.focus();</w:t>
         <w:br/>
         <w:t xml:space="preserve">    document.execCommand(button.dataset.richCommand, false, button.dataset.richValue || null);</w:t>
         <w:br/>
-        <w:t xml:space="preserve">    $("editDefinitionHtml").value = cleanRichHtml($("editDefinition").innerHTML);</w:t>
+        <w:t xml:space="preserve">    if ($("editDefinitionHtml") &amp;&amp; $("editDefinition")) $("editDefinitionHtml").value = cleanRichHtml($("editDefinition").innerHTML);</w:t>
         <w:br/>
         <w:t xml:space="preserve">  }));</w:t>
         <w:br/>
-        <w:t xml:space="preserve">  $("editDefinition").addEventListener("input", () =&gt; { $("editDefinitionHtml").value = cleanRichHtml($("editDefinition").innerHTML); });</w:t>
-        <w:br/>
-        <w:t xml:space="preserve">  $("clearTermBtn").addEventListener("click", clearTermForm);</w:t>
-        <w:br/>
-        <w:t xml:space="preserve">  $("deleteCurrentTermBtn").addEventListener("click", () =&gt; state.editingTermId &amp;&amp; deleteTerm(state.editingTermId));</w:t>
-        <w:br/>
-        <w:t xml:space="preserve">  $("adminSearchInput").addEventListener("input", renderTermRecords);</w:t>
-        <w:br/>
-        <w:t xml:space="preserve">  $("adminDomainFilter").addEventListener("change", renderTermRecords);</w:t>
-        <w:br/>
-        <w:t xml:space="preserve">  $("editDomain").addEventListener("change", () =&gt; fillTermSubtopicSelect("direct"));</w:t>
-        <w:br/>
-        <w:t xml:space="preserve">  $("editImageFile").addEventListener("change", (event) =&gt; {</w:t>
+        <w:t xml:space="preserve">  $("editDefinition")?.addEventListener("input", () =&gt; { if ($("editDefinitionHtml") &amp;&amp; $("editDefinition")) $("editDefinitionHtml").value = cleanRichHtml($("editDefinition").innerHTML); });</w:t>
+        <w:br/>
+        <w:t xml:space="preserve">  $("clearTermBtn")?.addEventListener("click", clearTermForm);</w:t>
+        <w:br/>
+        <w:t xml:space="preserve">  $("deleteCurrentTermBtn")?.addEventListener("click", () =&gt; state.editingTermId &amp;&amp; deleteTerm(state.editingTermId));</w:t>
+        <w:br/>
+        <w:t xml:space="preserve">  $("adminSearchInput")?.addEventListener("input", renderTermRecords);</w:t>
+        <w:br/>
+        <w:t xml:space="preserve">  $("adminDomainFilter")?.addEventListener("change", renderTermRecords);</w:t>
+        <w:br/>
+        <w:t xml:space="preserve">  $("editDomain")?.addEventListener("change", () =&gt; fillTermSubtopicSelect("direct"));</w:t>
+        <w:br/>
+        <w:t xml:space="preserve">  $("editImageFile")?.addEventListener("change", (event) =&gt; {</w:t>
         <w:br/>
         <w:t xml:space="preserve">    const file = event.target.files?.[0];</w:t>
         <w:br/>
@@ -7487,7 +7487,7 @@
         <w:br/>
         <w:t xml:space="preserve">    const reader = new FileReader();</w:t>
         <w:br/>
-        <w:t xml:space="preserve">    reader.onload = () =&gt; { state.embeddedImageData = String(reader.result); $("embeddedImageState").textContent = `הוטמעה: ${file.name}`; toast("התמונה הוטמעה בערך", "success"); };</w:t>
+        <w:t xml:space="preserve">    reader.onload = () =&gt; { state.embeddedImageData = String(reader.result); if ($("embeddedImageState")) $("embeddedImageState").textContent = `הוטמעה: ${file.name}`; toast("התמונה הוטמעה בערך", "success"); };</w:t>
         <w:br/>
         <w:t xml:space="preserve">    reader.onerror = () =&gt; toast("קריאת התמונה נכשלה", "error");</w:t>
         <w:br/>
@@ -7495,12 +7495,12 @@
         <w:br/>
         <w:t xml:space="preserve">  });</w:t>
         <w:br/>
-        <w:t xml:space="preserve">  $("removeEmbeddedImageBtn").addEventListener("click", () =&gt; { state.embeddedImageData = ""; $("editImageFile").value = ""; $("embeddedImageState").textContent = "לא הוטמעה תמונה"; });</w:t>
+        <w:t xml:space="preserve">  $("removeEmbeddedImageBtn")?.addEventListener("click", () =&gt; { state.embeddedImageData = ""; if ($("editImageFile")) $("editImageFile").value = ""; if ($("embeddedImageState")) $("embeddedImageState").textContent = "לא הוטמעה תמונה"; });</w:t>
         <w:br/>
         <w:br/>
         <w:t xml:space="preserve">  $("domainForm")?.addEventListener("submit", upsertDomainFromForm);</w:t>
         <w:br/>
-        <w:t xml:space="preserve">  $("addSubtopicBtn").addEventListener("click", () =&gt; {</w:t>
+        <w:t xml:space="preserve">  $("addSubtopicBtn")?.addEventListener("click", () =&gt; {</w:t>
         <w:br/>
         <w:t xml:space="preserve">    const existing = readSubtopicRows();</w:t>
         <w:br/>
@@ -7508,35 +7508,35 @@
         <w:br/>
         <w:t xml:space="preserve">  });</w:t>
         <w:br/>
-        <w:t xml:space="preserve">  $("clearDomainBtn").addEventListener("click", clearDomainForm);</w:t>
-        <w:br/>
-        <w:t xml:space="preserve">  $("deleteCurrentDomainBtn").addEventListener("click", () =&gt; state.editingDomainId &amp;&amp; deleteDomain(state.editingDomainId));</w:t>
+        <w:t xml:space="preserve">  $("clearDomainBtn")?.addEventListener("click", clearDomainForm);</w:t>
+        <w:br/>
+        <w:t xml:space="preserve">  $("deleteCurrentDomainBtn")?.addEventListener("click", () =&gt; state.editingDomainId &amp;&amp; deleteDomain(state.editingDomainId));</w:t>
         <w:br/>
         <w:t xml:space="preserve">  $("deleteDomainWithTermsBtn")?.addEventListener("click", () =&gt; state.editingDomainId &amp;&amp; deleteDomainWithTerms(state.editingDomainId));</w:t>
         <w:br/>
         <w:br/>
-        <w:t xml:space="preserve">  $("settingFontSize").addEventListener("input", (event) =&gt; { $("fontSizeOutput").textContent = `${event.target.value}px`; });</w:t>
-        <w:br/>
-        <w:t xml:space="preserve">  $("settingRadius").addEventListener("input", (event) =&gt; { $("radiusOutput").textContent = `${event.target.value}px`; });</w:t>
-        <w:br/>
-        <w:t xml:space="preserve">  $("applyAppearanceBtn").addEventListener("click", applyAppearanceFromForm);</w:t>
-        <w:br/>
-        <w:t xml:space="preserve">  $("resetAppearanceBtn").addEventListener("click", () =&gt; { settings.appearance = clone(DEFAULT_SETTINGS.appearance); settings.fields = clone(DEFAULT_SETTINGS.fields); loadAppearanceInputs(); renderFieldVisibility(); applyAppearanceFromForm(); });</w:t>
+        <w:t xml:space="preserve">  $("settingFontSize")?.addEventListener("input", (event) =&gt; { if ($("fontSizeOutput")) $("fontSizeOutput").textContent = `${event.target.value}px`; });</w:t>
+        <w:br/>
+        <w:t xml:space="preserve">  $("settingRadius")?.addEventListener("input", (event) =&gt; { if ($("radiusOutput")) $("radiusOutput").textContent = `${event.target.value}px`; });</w:t>
+        <w:br/>
+        <w:t xml:space="preserve">  $("applyAppearanceBtn")?.addEventListener("click", applyAppearanceFromForm);</w:t>
+        <w:br/>
+        <w:t xml:space="preserve">  $("resetAppearanceBtn")?.addEventListener("click", () =&gt; { settings.appearance = clone(DEFAULT_SETTINGS.appearance); settings.fields = clone(DEFAULT_SETTINGS.fields); loadAppearanceInputs(); renderFieldVisibility(); applyAppearanceFromForm(); });</w:t>
         <w:br/>
         <w:br/>
         <w:t xml:space="preserve">  $("exportContentJsonBtn")?.addEventListener("click", exportContentJson);</w:t>
         <w:br/>
         <w:t xml:space="preserve">  $("exportFullJsonBtn")?.addEventListener("click", exportFullJson);</w:t>
         <w:br/>
-        <w:t xml:space="preserve">  $("exportCsvBtn").addEventListener("click", exportCsv);</w:t>
+        <w:t xml:space="preserve">  $("exportCsvBtn")?.addEventListener("click", exportCsv);</w:t>
         <w:br/>
         <w:t xml:space="preserve">  $("restoreRecoveryBtn")?.addEventListener("click", restoreLatestRecoverySnapshot);</w:t>
         <w:br/>
         <w:t xml:space="preserve">  $("auditCatalogBtn")?.addEventListener("click", runCatalogAudit);</w:t>
         <w:br/>
-        <w:t xml:space="preserve">  $("importJsonBtn").addEventListener("click", () =&gt; $("importJsonFile").click());</w:t>
-        <w:br/>
-        <w:t xml:space="preserve">  $("importJsonFile").addEventListener("change", (event) =&gt; event.target.files?.[0] &amp;&amp; importJsonFile(event.target.files[0]));</w:t>
+        <w:t xml:space="preserve">  $("importJsonBtn")?.addEventListener("click", () =&gt; $("importJsonFile")?.click());</w:t>
+        <w:br/>
+        <w:t xml:space="preserve">  $("importJsonFile")?.addEventListener("change", (event) =&gt; event.target.files?.[0] &amp;&amp; importJsonFile(event.target.files[0]));</w:t>
         <w:br/>
         <w:t xml:space="preserve">  $("pinSettingsForm")?.addEventListener("submit", (event) =&gt; {</w:t>
         <w:br/>
@@ -7590,7 +7590,7 @@
         <w:br/>
         <w:t xml:space="preserve">  });</w:t>
         <w:br/>
-        <w:t xml:space="preserve">  $("clearProgressBtn").addEventListener("click", () =&gt; {</w:t>
+        <w:t xml:space="preserve">  $("clearProgressBtn")?.addEventListener("click", () =&gt; {</w:t>
         <w:br/>
         <w:t xml:space="preserve">    if (!confirm("לאפס מועדפים, היסטוריה והתקדמות למידה?")) return;</w:t>
         <w:br/>
@@ -7600,7 +7600,7 @@
         <w:br/>
         <w:t xml:space="preserve">  });</w:t>
         <w:br/>
-        <w:t xml:space="preserve">  $("resetAllBtn").addEventListener("click", () =&gt; {</w:t>
+        <w:t xml:space="preserve">  $("resetAllBtn")?.addEventListener("click", () =&gt; {</w:t>
         <w:br/>
         <w:t xml:space="preserve">    if (!confirm("איפוס מלא ימחק את כל הנתונים המקומיים ויחזיר את ברירת המחדל. להמשיך?")) return;</w:t>
         <w:br/>

</xml_diff>